<commit_message>
Ajoute la section 12 Configuration noeud par noeud au guide utilisateur (144)
Detaille chaque noeud du workflow 143 (webhook, intake email/OCR/Drive, PII, traduction, circuit Expert/Secretariat) avec sa configuration requise, plus un plan de test en 6 etapes jusqu'a la mise en production.

Co-Authored-By: Claude Sonnet 5 <noreply@anthropic.com>
</commit_message>
<xml_diff>
--- a/docs/transferai-admin/144_Guide_Utilisateur_Workflow_143_Traduction_Internationale_Securisee_06juillet2026.docx
+++ b/docs/transferai-admin/144_Guide_Utilisateur_Workflow_143_Traduction_Internationale_Securisee_06juillet2026.docx
@@ -1088,6 +1088,850 @@
     </w:p>
     <w:p>
       <w:pPr>
+        <w:spacing w:before="360" w:after="200" w:line="240" w:lineRule="auto"/>
+      </w:pPr>
+      <w:r>
+        <w:rPr>
+          <w:rFonts w:ascii="Calibri" w:hAnsi="Calibri"/>
+          <w:b/>
+          <w:color w:val="2E74B5"/>
+          <w:sz w:val="32"/>
+        </w:rPr>
+        <w:t>12. Configuration nœud par nœud</w:t>
+      </w:r>
+    </w:p>
+    <w:p>
+      <w:pPr>
+        <w:spacing w:before="0" w:after="160" w:line="300" w:lineRule="auto"/>
+      </w:pPr>
+      <w:r>
+        <w:rPr>
+          <w:rFonts w:ascii="Calibri" w:hAnsi="Calibri"/>
+          <w:b w:val="0"/>
+          <w:sz w:val="22"/>
+        </w:rPr>
+        <w:t>Cette section detaille, nœud par nœud, la configuration necessaire dans n8n pour faire fonctionner le workflow 143 de bout en bout, jusqu’au plan de test.</w:t>
+      </w:r>
+    </w:p>
+    <w:p>
+      <w:pPr>
+        <w:spacing w:before="200" w:after="120" w:line="300" w:lineRule="auto"/>
+      </w:pPr>
+      <w:r>
+        <w:rPr>
+          <w:rFonts w:ascii="Calibri" w:hAnsi="Calibri"/>
+          <w:b/>
+          <w:color w:val="10263F"/>
+          <w:sz w:val="24"/>
+        </w:rPr>
+        <w:t>0. Prerequis avant import</w:t>
+      </w:r>
+    </w:p>
+    <w:p>
+      <w:pPr>
+        <w:pStyle w:val="ListBullet"/>
+        <w:spacing w:before="0" w:after="80" w:line="300" w:lineRule="auto"/>
+      </w:pPr>
+      <w:r>
+        <w:rPr>
+          <w:rFonts w:ascii="Calibri" w:hAnsi="Calibri"/>
+          <w:b/>
+          <w:sz w:val="22"/>
+        </w:rPr>
+        <w:t xml:space="preserve">Variables d’environnement : </w:t>
+      </w:r>
+      <w:r>
+        <w:rPr>
+          <w:rFonts w:ascii="Calibri" w:hAnsi="Calibri"/>
+          <w:b w:val="0"/>
+          <w:sz w:val="22"/>
+        </w:rPr>
+        <w:t>`OPENAI_API_KEY` (obligatoire, OCR + traduction + relecture), `RESEND_API_KEY` (obligatoire, tous les envois e-mail), `INTERNAL_REVIEW_EMAIL` (recommande), `OUTREACH_FROM_EMAIL` (optionnel), `SECRETARIAT_EMAIL` (optionnel, defaut secretariat@transferai.ci), `SECRETARIAT_FROM_EMAIL` (optionnel), `N8N_BASE_URL` (recommande, pour le lien de reprise du circuit Expert).</w:t>
+      </w:r>
+    </w:p>
+    <w:p>
+      <w:pPr>
+        <w:pStyle w:val="ListBullet"/>
+        <w:spacing w:before="0" w:after="120" w:line="300" w:lineRule="auto"/>
+      </w:pPr>
+      <w:r>
+        <w:rPr>
+          <w:rFonts w:ascii="Calibri" w:hAnsi="Calibri"/>
+          <w:b/>
+          <w:sz w:val="22"/>
+        </w:rPr>
+        <w:t xml:space="preserve">Credentials : </w:t>
+      </w:r>
+      <w:r>
+        <w:rPr>
+          <w:rFonts w:ascii="Calibri" w:hAnsi="Calibri"/>
+          <w:b w:val="0"/>
+          <w:sz w:val="22"/>
+        </w:rPr>
+        <w:t>une credential IMAP (boite mail du cabinet) et une credential Google Drive OAuth2 a creer dans n8n avant l’import.</w:t>
+      </w:r>
+    </w:p>
+    <w:p>
+      <w:pPr>
+        <w:spacing w:before="200" w:after="120" w:line="300" w:lineRule="auto"/>
+      </w:pPr>
+      <w:r>
+        <w:rPr>
+          <w:rFonts w:ascii="Calibri" w:hAnsi="Calibri"/>
+          <w:b/>
+          <w:color w:val="10263F"/>
+          <w:sz w:val="24"/>
+        </w:rPr>
+        <w:t>A. Point d’entree 1 — Webhook</w:t>
+      </w:r>
+    </w:p>
+    <w:p>
+      <w:pPr>
+        <w:pStyle w:val="ListBullet"/>
+        <w:spacing w:before="0" w:after="120" w:line="300" w:lineRule="auto"/>
+      </w:pPr>
+      <w:r>
+        <w:rPr>
+          <w:rFonts w:ascii="Calibri" w:hAnsi="Calibri"/>
+          <w:b/>
+          <w:sz w:val="22"/>
+        </w:rPr>
+        <w:t xml:space="preserve">Webhook - Traduction securisee : </w:t>
+      </w:r>
+      <w:r>
+        <w:rPr>
+          <w:rFonts w:ascii="Calibri" w:hAnsi="Calibri"/>
+          <w:b w:val="0"/>
+          <w:sz w:val="22"/>
+        </w:rPr>
+        <w:t>recoit les demandes JSON directes (integration externe, formulaire). Rien a configurer : `path: traduction-officielle-securisee`, methode POST. URL generee apres import : https://&lt;votre-instance&gt;/webhook/traduction-officielle-securisee.</w:t>
+      </w:r>
+    </w:p>
+    <w:p>
+      <w:pPr>
+        <w:spacing w:before="200" w:after="120" w:line="300" w:lineRule="auto"/>
+      </w:pPr>
+      <w:r>
+        <w:rPr>
+          <w:rFonts w:ascii="Calibri" w:hAnsi="Calibri"/>
+          <w:b/>
+          <w:color w:val="10263F"/>
+          <w:sz w:val="24"/>
+        </w:rPr>
+        <w:t>B. Point d’entree 2 — E-mail (documents scannes)</w:t>
+      </w:r>
+    </w:p>
+    <w:p>
+      <w:pPr>
+        <w:pStyle w:val="ListBullet"/>
+        <w:spacing w:before="0" w:after="80" w:line="300" w:lineRule="auto"/>
+      </w:pPr>
+      <w:r>
+        <w:rPr>
+          <w:rFonts w:ascii="Calibri" w:hAnsi="Calibri"/>
+          <w:b/>
+          <w:sz w:val="22"/>
+        </w:rPr>
+        <w:t xml:space="preserve">Email Trigger - Boite Traduction : </w:t>
+      </w:r>
+      <w:r>
+        <w:rPr>
+          <w:rFonts w:ascii="Calibri" w:hAnsi="Calibri"/>
+          <w:b w:val="0"/>
+          <w:sz w:val="22"/>
+        </w:rPr>
+        <w:t>se declenche a chaque e-mail recu sur la boite du cabinet. A configurer : la credential IMAP (hote, port, identifiants). Verifier `postProcessAction: "read"` pour eviter les doublons de traitement.</w:t>
+      </w:r>
+    </w:p>
+    <w:p>
+      <w:pPr>
+        <w:pStyle w:val="ListBullet"/>
+        <w:spacing w:before="0" w:after="80" w:line="300" w:lineRule="auto"/>
+      </w:pPr>
+      <w:r>
+        <w:rPr>
+          <w:rFonts w:ascii="Calibri" w:hAnsi="Calibri"/>
+          <w:b/>
+          <w:sz w:val="22"/>
+        </w:rPr>
+        <w:t xml:space="preserve">Extraire piece jointe et metadonnees : </w:t>
+      </w:r>
+      <w:r>
+        <w:rPr>
+          <w:rFonts w:ascii="Calibri" w:hAnsi="Calibri"/>
+          <w:b w:val="0"/>
+          <w:sz w:val="22"/>
+        </w:rPr>
+        <w:t>recupere la 1ere piece jointe, l’expediteur, le sujet, et deduit le type de document par mots-cles. Ne traite qu’une seule piece jointe par e-mail : dupliquer OCR + Drive si plusieurs documents arrivent dans le meme e-mail. En test reel, verifiez les noms de champs `json.from` / `json.subject` renvoyes par votre version du nœud IMAP (ils varient selon la version).</w:t>
+      </w:r>
+    </w:p>
+    <w:p>
+      <w:pPr>
+        <w:pStyle w:val="ListBullet"/>
+        <w:spacing w:before="0" w:after="80" w:line="300" w:lineRule="auto"/>
+      </w:pPr>
+      <w:r>
+        <w:rPr>
+          <w:rFonts w:ascii="Calibri" w:hAnsi="Calibri"/>
+          <w:b/>
+          <w:sz w:val="22"/>
+        </w:rPr>
+        <w:t xml:space="preserve">Deposer sur Google Drive - Dossier entrant : </w:t>
+      </w:r>
+      <w:r>
+        <w:rPr>
+          <w:rFonts w:ascii="Calibri" w:hAnsi="Calibri"/>
+          <w:b w:val="0"/>
+          <w:sz w:val="22"/>
+        </w:rPr>
+        <w:t>archive le document scanne tel que recu, avant toute traduction. A configurer : la credential Google Drive OAuth2. Le dossier de destination est fixe en dur sur l’ID du dossier dedie « Documents_Clients_Entrants_CONFIDENTIEL » (1Psjhy2-2RYJxukFJiWey1osukR2ygk9A), cree specifiquement pour ce workflow, en dehors de l’arborescence « Base documentaire RAG » et de ses 8 sous-dossiers surveilles par le pipeline d’ingestion RAG.</w:t>
+      </w:r>
+    </w:p>
+    <w:p>
+      <w:pPr>
+        <w:pStyle w:val="ListBullet"/>
+        <w:spacing w:before="0" w:after="80" w:line="300" w:lineRule="auto"/>
+      </w:pPr>
+      <w:r>
+        <w:rPr>
+          <w:rFonts w:ascii="Calibri" w:hAnsi="Calibri"/>
+          <w:b/>
+          <w:color w:val="B91C1C"/>
+          <w:sz w:val="22"/>
+        </w:rPr>
+        <w:t xml:space="preserve">Important — </w:t>
+      </w:r>
+      <w:r>
+        <w:rPr>
+          <w:rFonts w:ascii="Calibri" w:hAnsi="Calibri"/>
+          <w:b w:val="0"/>
+          <w:sz w:val="22"/>
+        </w:rPr>
+        <w:t>ne jamais rediriger ce champ vers l’un des 8 dossiers RAG : les documents traites ici contiennent des donnees personnelles reelles (passeports, actes, diplomes) qui ne doivent jamais etre ingerees dans la base de connaissance accessible aux prospects externes.</w:t>
+      </w:r>
+    </w:p>
+    <w:p>
+      <w:pPr>
+        <w:pStyle w:val="ListBullet"/>
+        <w:spacing w:before="0" w:after="80" w:line="300" w:lineRule="auto"/>
+      </w:pPr>
+      <w:r>
+        <w:rPr>
+          <w:rFonts w:ascii="Calibri" w:hAnsi="Calibri"/>
+          <w:b w:val="0"/>
+          <w:sz w:val="22"/>
+        </w:rPr>
+        <w:t>Un message « [ERROR: not accessible via UI, please run node] » peut apparaitre sur le champ Parent Folder dans l’editeur n8n : ce n’est pas bloquant, c’est un avertissement cosmetique. Le champ essaie de resoudre le nom du dossier pour l’afficher dans le menu deroulant, mais ne peut pas le faire tant que le nœud n’a pas ete execute avec de vraies donnees. Cela ne signifie pas que le nœud echouera a l’execution reelle.</w:t>
+      </w:r>
+    </w:p>
+    <w:p>
+      <w:pPr>
+        <w:pStyle w:val="ListBullet"/>
+        <w:spacing w:before="0" w:after="80" w:line="300" w:lineRule="auto"/>
+      </w:pPr>
+      <w:r>
+        <w:rPr>
+          <w:rFonts w:ascii="Calibri" w:hAnsi="Calibri"/>
+          <w:b w:val="0"/>
+          <w:sz w:val="22"/>
+        </w:rPr>
+        <w:t>Verifiez que le compte Google Drive de la credential a bien un acces en ecriture au dossier cible.</w:t>
+      </w:r>
+    </w:p>
+    <w:p>
+      <w:pPr>
+        <w:pStyle w:val="ListBullet"/>
+        <w:spacing w:before="0" w:after="80" w:line="300" w:lineRule="auto"/>
+      </w:pPr>
+      <w:r>
+        <w:rPr>
+          <w:rFonts w:ascii="Calibri" w:hAnsi="Calibri"/>
+          <w:b w:val="0"/>
+          <w:sz w:val="22"/>
+        </w:rPr>
+        <w:t>« Parent Drive » = « My Drive » est correct seulement si le dossier appartient au Drive personnel du compte connecte. Si le dossier cible est en realite dans un Drive partage (Shared Drive) de l’organisation, il faut selectionner ce Drive partage a la place, sinon l’upload echouera.</w:t>
+      </w:r>
+    </w:p>
+    <w:p>
+      <w:pPr>
+        <w:pStyle w:val="ListBullet"/>
+        <w:spacing w:before="0" w:after="120" w:line="300" w:lineRule="auto"/>
+      </w:pPr>
+      <w:r>
+        <w:rPr>
+          <w:rFonts w:ascii="Calibri" w:hAnsi="Calibri"/>
+          <w:b w:val="0"/>
+          <w:sz w:val="22"/>
+        </w:rPr>
+        <w:t>Pour faire disparaitre l’avertissement et valider la configuration : executez d’abord les nœuds precedents avec de vraies donnees (ou des donnees de test epinglees sur le nœud Email Trigger), puis cliquez sur « Execute step » sur ce nœud.</w:t>
+      </w:r>
+    </w:p>
+    <w:p>
+      <w:pPr>
+        <w:pStyle w:val="ListBullet"/>
+        <w:spacing w:before="0" w:after="80" w:line="300" w:lineRule="auto"/>
+      </w:pPr>
+      <w:r>
+        <w:rPr>
+          <w:rFonts w:ascii="Calibri" w:hAnsi="Calibri"/>
+          <w:b/>
+          <w:sz w:val="22"/>
+        </w:rPr>
+        <w:t xml:space="preserve">Preparer OCR - Encoder document : </w:t>
+      </w:r>
+      <w:r>
+        <w:rPr>
+          <w:rFonts w:ascii="Calibri" w:hAnsi="Calibri"/>
+          <w:b w:val="0"/>
+          <w:sz w:val="22"/>
+        </w:rPr>
+        <w:t>encode la piece jointe en base64 pour l’appel OCR. Rien a configurer.</w:t>
+      </w:r>
+    </w:p>
+    <w:p>
+      <w:pPr>
+        <w:pStyle w:val="ListBullet"/>
+        <w:spacing w:before="0" w:after="80" w:line="300" w:lineRule="auto"/>
+      </w:pPr>
+      <w:r>
+        <w:rPr>
+          <w:rFonts w:ascii="Calibri" w:hAnsi="Calibri"/>
+          <w:b/>
+          <w:sz w:val="22"/>
+        </w:rPr>
+        <w:t xml:space="preserve">OpenAI - OCR document scanne : </w:t>
+      </w:r>
+      <w:r>
+        <w:rPr>
+          <w:rFonts w:ascii="Calibri" w:hAnsi="Calibri"/>
+          <w:b w:val="0"/>
+          <w:sz w:val="22"/>
+        </w:rPr>
+        <w:t>extrait le texte du scan (image ou PDF) via GPT-4.1 vision. Utilise `OPENAI_API_KEY`. Rien d’autre a configurer.</w:t>
+      </w:r>
+    </w:p>
+    <w:p>
+      <w:pPr>
+        <w:pStyle w:val="ListBullet"/>
+        <w:spacing w:before="0" w:after="120" w:line="300" w:lineRule="auto"/>
+      </w:pPr>
+      <w:r>
+        <w:rPr>
+          <w:rFonts w:ascii="Calibri" w:hAnsi="Calibri"/>
+          <w:b/>
+          <w:sz w:val="22"/>
+        </w:rPr>
+        <w:t xml:space="preserve">Parser texte OCR → Construire donnees depuis email : </w:t>
+      </w:r>
+      <w:r>
+        <w:rPr>
+          <w:rFonts w:ascii="Calibri" w:hAnsi="Calibri"/>
+          <w:b w:val="0"/>
+          <w:sz w:val="22"/>
+        </w:rPr>
+        <w:t>parse la reponse OCR puis reformate les donnees dans la meme structure que le webhook (`body.texte`, `body.langue_source`, etc.), et se rebranche directement sur `Extraire demande et politique` pour reutiliser tout le pipeline. Langues par defaut codees en dur (fr vers en) : a ajuster si vos flux entrants varient.</w:t>
+      </w:r>
+    </w:p>
+    <w:p>
+      <w:pPr>
+        <w:spacing w:before="200" w:after="120" w:line="300" w:lineRule="auto"/>
+      </w:pPr>
+      <w:r>
+        <w:rPr>
+          <w:rFonts w:ascii="Calibri" w:hAnsi="Calibri"/>
+          <w:b/>
+          <w:color w:val="10263F"/>
+          <w:sz w:val="24"/>
+        </w:rPr>
+        <w:t>C. Extraction, detection PII, pseudonymisation (commun aux deux entrees)</w:t>
+      </w:r>
+    </w:p>
+    <w:p>
+      <w:pPr>
+        <w:pStyle w:val="ListBullet"/>
+        <w:spacing w:before="0" w:after="80" w:line="300" w:lineRule="auto"/>
+      </w:pPr>
+      <w:r>
+        <w:rPr>
+          <w:rFonts w:ascii="Calibri" w:hAnsi="Calibri"/>
+          <w:b/>
+          <w:sz w:val="22"/>
+        </w:rPr>
+        <w:t xml:space="preserve">Extraire demande et politique : </w:t>
+      </w:r>
+      <w:r>
+        <w:rPr>
+          <w:rFonts w:ascii="Calibri" w:hAnsi="Calibri"/>
+          <w:b w:val="0"/>
+          <w:sz w:val="22"/>
+        </w:rPr>
+        <w:t>normalise les champs d’entree, calcule la sensibilite (elevee/standard) selon des mots-cles (visa, passeport, diplomatique...), genere `traduction_id`. Rien a configurer, mais relisez la liste de mots-cles si vous voulez l’ajuster.</w:t>
+      </w:r>
+    </w:p>
+    <w:p>
+      <w:pPr>
+        <w:pStyle w:val="ListBullet"/>
+        <w:spacing w:before="0" w:after="80" w:line="300" w:lineRule="auto"/>
+      </w:pPr>
+      <w:r>
+        <w:rPr>
+          <w:rFonts w:ascii="Calibri" w:hAnsi="Calibri"/>
+          <w:b/>
+          <w:sz w:val="22"/>
+        </w:rPr>
+        <w:t xml:space="preserve">Detecter PII : </w:t>
+      </w:r>
+      <w:r>
+        <w:rPr>
+          <w:rFonts w:ascii="Calibri" w:hAnsi="Calibri"/>
+          <w:b w:val="0"/>
+          <w:sz w:val="22"/>
+        </w:rPr>
+        <w:t>detecte e-mails, telephones, passeports, dates, references et URLs par regex et champs structures. Rien a configurer.</w:t>
+      </w:r>
+    </w:p>
+    <w:p>
+      <w:pPr>
+        <w:pStyle w:val="ListBullet"/>
+        <w:spacing w:before="0" w:after="120" w:line="300" w:lineRule="auto"/>
+      </w:pPr>
+      <w:r>
+        <w:rPr>
+          <w:rFonts w:ascii="Calibri" w:hAnsi="Calibri"/>
+          <w:b/>
+          <w:sz w:val="22"/>
+        </w:rPr>
+        <w:t xml:space="preserve">Pseudonymiser localement : </w:t>
+      </w:r>
+      <w:r>
+        <w:rPr>
+          <w:rFonts w:ascii="Calibri" w:hAnsi="Calibri"/>
+          <w:b w:val="0"/>
+          <w:sz w:val="22"/>
+        </w:rPr>
+        <w:t>remplace chaque PII detectee par un jeton (PERSON_001, etc.) et construit la table de correspondance locale. Rien a configurer.</w:t>
+      </w:r>
+    </w:p>
+    <w:p>
+      <w:pPr>
+        <w:spacing w:before="200" w:after="120" w:line="300" w:lineRule="auto"/>
+      </w:pPr>
+      <w:r>
+        <w:rPr>
+          <w:rFonts w:ascii="Calibri" w:hAnsi="Calibri"/>
+          <w:b/>
+          <w:color w:val="10263F"/>
+          <w:sz w:val="24"/>
+        </w:rPr>
+        <w:t>D. Traduction et relecture IA</w:t>
+      </w:r>
+    </w:p>
+    <w:p>
+      <w:pPr>
+        <w:pStyle w:val="ListBullet"/>
+        <w:spacing w:before="0" w:after="80" w:line="300" w:lineRule="auto"/>
+      </w:pPr>
+      <w:r>
+        <w:rPr>
+          <w:rFonts w:ascii="Calibri" w:hAnsi="Calibri"/>
+          <w:b/>
+          <w:sz w:val="22"/>
+        </w:rPr>
+        <w:t xml:space="preserve">OpenAI - Traduction pseudonymisee → Parser traduction : </w:t>
+      </w:r>
+      <w:r>
+        <w:rPr>
+          <w:rFonts w:ascii="Calibri" w:hAnsi="Calibri"/>
+          <w:b w:val="0"/>
+          <w:sz w:val="22"/>
+        </w:rPr>
+        <w:t>traduit uniquement le texte pseudonymise (jamais les vraies donnees). Utilise `OPENAI_API_KEY`, modele gpt-4.1.</w:t>
+      </w:r>
+    </w:p>
+    <w:p>
+      <w:pPr>
+        <w:pStyle w:val="ListBullet"/>
+        <w:spacing w:before="0" w:after="120" w:line="300" w:lineRule="auto"/>
+      </w:pPr>
+      <w:r>
+        <w:rPr>
+          <w:rFonts w:ascii="Calibri" w:hAnsi="Calibri"/>
+          <w:b/>
+          <w:sz w:val="22"/>
+        </w:rPr>
+        <w:t xml:space="preserve">OpenAI - Relecture qualite pseudonymisee → Parser relecture : </w:t>
+      </w:r>
+      <w:r>
+        <w:rPr>
+          <w:rFonts w:ascii="Calibri" w:hAnsi="Calibri"/>
+          <w:b w:val="0"/>
+          <w:sz w:val="22"/>
+        </w:rPr>
+        <w:t>note la traduction (score, risques, corrections) via un schema JSON strict. Rien a configurer. Le score conditionne le routage (seuil 96/100).</w:t>
+      </w:r>
+    </w:p>
+    <w:p>
+      <w:pPr>
+        <w:spacing w:before="200" w:after="120" w:line="300" w:lineRule="auto"/>
+      </w:pPr>
+      <w:r>
+        <w:rPr>
+          <w:rFonts w:ascii="Calibri" w:hAnsi="Calibri"/>
+          <w:b/>
+          <w:color w:val="10263F"/>
+          <w:sz w:val="24"/>
+        </w:rPr>
+        <w:t>E. Assemblage et routage</w:t>
+      </w:r>
+    </w:p>
+    <w:p>
+      <w:pPr>
+        <w:pStyle w:val="ListBullet"/>
+        <w:spacing w:before="0" w:after="80" w:line="300" w:lineRule="auto"/>
+      </w:pPr>
+      <w:r>
+        <w:rPr>
+          <w:rFonts w:ascii="Calibri" w:hAnsi="Calibri"/>
+          <w:b/>
+          <w:sz w:val="22"/>
+        </w:rPr>
+        <w:t xml:space="preserve">Reidentifier et assembler : </w:t>
+      </w:r>
+      <w:r>
+        <w:rPr>
+          <w:rFonts w:ascii="Calibri" w:hAnsi="Calibri"/>
+          <w:b w:val="0"/>
+          <w:sz w:val="22"/>
+        </w:rPr>
+        <w:t>reinjecte les vraies valeurs dans la traduction, construit le HTML bilingue final avec le footer de gouvernance. Calcule `review_required` = vrai si sensibilite elevee OU score &lt; 96 OU relecture invalidee. Rien a configurer.</w:t>
+      </w:r>
+    </w:p>
+    <w:p>
+      <w:pPr>
+        <w:pStyle w:val="ListBullet"/>
+        <w:spacing w:before="0" w:after="120" w:line="300" w:lineRule="auto"/>
+      </w:pPr>
+      <w:r>
+        <w:rPr>
+          <w:rFonts w:ascii="Calibri" w:hAnsi="Calibri"/>
+          <w:b/>
+          <w:sz w:val="22"/>
+        </w:rPr>
+        <w:t xml:space="preserve">Validation requise ? : </w:t>
+      </w:r>
+      <w:r>
+        <w:rPr>
+          <w:rFonts w:ascii="Calibri" w:hAnsi="Calibri"/>
+          <w:b w:val="0"/>
+          <w:sz w:val="22"/>
+        </w:rPr>
+        <w:t>vrai → circuit Expert (section F). Faux → envoi automatique direct (section G).</w:t>
+      </w:r>
+    </w:p>
+    <w:p>
+      <w:pPr>
+        <w:spacing w:before="200" w:after="120" w:line="300" w:lineRule="auto"/>
+      </w:pPr>
+      <w:r>
+        <w:rPr>
+          <w:rFonts w:ascii="Calibri" w:hAnsi="Calibri"/>
+          <w:b/>
+          <w:color w:val="10263F"/>
+          <w:sz w:val="24"/>
+        </w:rPr>
+        <w:t>F. Circuit de validation Expert</w:t>
+      </w:r>
+    </w:p>
+    <w:p>
+      <w:pPr>
+        <w:pStyle w:val="ListBullet"/>
+        <w:spacing w:before="0" w:after="80" w:line="300" w:lineRule="auto"/>
+      </w:pPr>
+      <w:r>
+        <w:rPr>
+          <w:rFonts w:ascii="Calibri" w:hAnsi="Calibri"/>
+          <w:b/>
+          <w:sz w:val="22"/>
+        </w:rPr>
+        <w:t xml:space="preserve">Generer liens de decision Expert : </w:t>
+      </w:r>
+      <w:r>
+        <w:rPr>
+          <w:rFonts w:ascii="Calibri" w:hAnsi="Calibri"/>
+          <w:b w:val="0"/>
+          <w:sz w:val="22"/>
+        </w:rPr>
+        <w:t>construit les liens d’approbation/rejet a partir de `$execution.resumeUrl` (ou du fallback `N8N_BASE_URL`). Necessite une version n8n recente supportant `$execution.resumeUrl` ; sinon, verifiez que `N8N_BASE_URL` est bien defini.</w:t>
+      </w:r>
+    </w:p>
+    <w:p>
+      <w:pPr>
+        <w:pStyle w:val="ListBullet"/>
+        <w:spacing w:before="0" w:after="80" w:line="300" w:lineRule="auto"/>
+      </w:pPr>
+      <w:r>
+        <w:rPr>
+          <w:rFonts w:ascii="Calibri" w:hAnsi="Calibri"/>
+          <w:b/>
+          <w:sz w:val="22"/>
+        </w:rPr>
+        <w:t xml:space="preserve">Notifier Expert - Demande de validation : </w:t>
+      </w:r>
+      <w:r>
+        <w:rPr>
+          <w:rFonts w:ascii="Calibri" w:hAnsi="Calibri"/>
+          <w:b w:val="0"/>
+          <w:sz w:val="22"/>
+        </w:rPr>
+        <w:t>envoie l’e-mail a `email_validateur` (ou `INTERNAL_REVIEW_EMAIL`) avec les 2 boutons Valider/Rejeter.</w:t>
+      </w:r>
+    </w:p>
+    <w:p>
+      <w:pPr>
+        <w:pStyle w:val="ListBullet"/>
+        <w:spacing w:before="0" w:after="80" w:line="300" w:lineRule="auto"/>
+      </w:pPr>
+      <w:r>
+        <w:rPr>
+          <w:rFonts w:ascii="Calibri" w:hAnsi="Calibri"/>
+          <w:b/>
+          <w:sz w:val="22"/>
+        </w:rPr>
+        <w:t xml:space="preserve">Attente decision Expert (Wait) : </w:t>
+      </w:r>
+      <w:r>
+        <w:rPr>
+          <w:rFonts w:ascii="Calibri" w:hAnsi="Calibri"/>
+          <w:b w:val="0"/>
+          <w:sz w:val="22"/>
+        </w:rPr>
+        <w:t>le workflow se met en pause ici jusqu’a ce que l’expert clique un des deux liens. L’execution reste « en attente » dans n8n tant que l’expert n’a pas repondu : surveillez les executions bloquees.</w:t>
+      </w:r>
+    </w:p>
+    <w:p>
+      <w:pPr>
+        <w:pStyle w:val="ListBullet"/>
+        <w:spacing w:before="0" w:after="120" w:line="300" w:lineRule="auto"/>
+      </w:pPr>
+      <w:r>
+        <w:rPr>
+          <w:rFonts w:ascii="Calibri" w:hAnsi="Calibri"/>
+          <w:b/>
+          <w:sz w:val="22"/>
+        </w:rPr>
+        <w:t xml:space="preserve">Interpreter decision Expert → Expert a valide ? : </w:t>
+      </w:r>
+      <w:r>
+        <w:rPr>
+          <w:rFonts w:ascii="Calibri" w:hAnsi="Calibri"/>
+          <w:b w:val="0"/>
+          <w:sz w:val="22"/>
+        </w:rPr>
+        <w:t>lit le parametre `decision` recu sur le lien clique et branche vers Secretariat ou Rejet.</w:t>
+      </w:r>
+    </w:p>
+    <w:p>
+      <w:pPr>
+        <w:spacing w:before="200" w:after="120" w:line="300" w:lineRule="auto"/>
+      </w:pPr>
+      <w:r>
+        <w:rPr>
+          <w:rFonts w:ascii="Calibri" w:hAnsi="Calibri"/>
+          <w:b/>
+          <w:color w:val="10263F"/>
+          <w:sz w:val="24"/>
+        </w:rPr>
+        <w:t>G. Envoi final</w:t>
+      </w:r>
+    </w:p>
+    <w:p>
+      <w:pPr>
+        <w:pStyle w:val="ListBullet"/>
+        <w:spacing w:before="0" w:after="80" w:line="300" w:lineRule="auto"/>
+      </w:pPr>
+      <w:r>
+        <w:rPr>
+          <w:rFonts w:ascii="Calibri" w:hAnsi="Calibri"/>
+          <w:b/>
+          <w:sz w:val="22"/>
+        </w:rPr>
+        <w:t xml:space="preserve">Secretariat - Envoi client (apres validation) : </w:t>
+      </w:r>
+      <w:r>
+        <w:rPr>
+          <w:rFonts w:ascii="Calibri" w:hAnsi="Calibri"/>
+          <w:b w:val="0"/>
+          <w:sz w:val="22"/>
+        </w:rPr>
+        <w:t>envoi final au client, au nom du secretariat (`SECRETARIAT_FROM_EMAIL`), apres validation expert.</w:t>
+      </w:r>
+    </w:p>
+    <w:p>
+      <w:pPr>
+        <w:pStyle w:val="ListBullet"/>
+        <w:spacing w:before="0" w:after="80" w:line="300" w:lineRule="auto"/>
+      </w:pPr>
+      <w:r>
+        <w:rPr>
+          <w:rFonts w:ascii="Calibri" w:hAnsi="Calibri"/>
+          <w:b/>
+          <w:sz w:val="22"/>
+        </w:rPr>
+        <w:t xml:space="preserve">Notifier rejet - Revision necessaire : </w:t>
+      </w:r>
+      <w:r>
+        <w:rPr>
+          <w:rFonts w:ascii="Calibri" w:hAnsi="Calibri"/>
+          <w:b w:val="0"/>
+          <w:sz w:val="22"/>
+        </w:rPr>
+        <w:t>alerte interne si rejet. Le client ne recoit rien.</w:t>
+      </w:r>
+    </w:p>
+    <w:p>
+      <w:pPr>
+        <w:pStyle w:val="ListBullet"/>
+        <w:spacing w:before="0" w:after="80" w:line="300" w:lineRule="auto"/>
+      </w:pPr>
+      <w:r>
+        <w:rPr>
+          <w:rFonts w:ascii="Calibri" w:hAnsi="Calibri"/>
+          <w:b/>
+          <w:sz w:val="22"/>
+        </w:rPr>
+        <w:t xml:space="preserve">Envoyer au client : </w:t>
+      </w:r>
+      <w:r>
+        <w:rPr>
+          <w:rFonts w:ascii="Calibri" w:hAnsi="Calibri"/>
+          <w:b w:val="0"/>
+          <w:sz w:val="22"/>
+        </w:rPr>
+        <w:t>envoi automatique direct pour les documents a sensibilite standard (pas de passage expert/secretariat).</w:t>
+      </w:r>
+    </w:p>
+    <w:p>
+      <w:pPr>
+        <w:pStyle w:val="ListBullet"/>
+        <w:spacing w:before="0" w:after="120" w:line="300" w:lineRule="auto"/>
+      </w:pPr>
+      <w:r>
+        <w:rPr>
+          <w:rFonts w:ascii="Calibri" w:hAnsi="Calibri"/>
+          <w:b/>
+          <w:sz w:val="22"/>
+        </w:rPr>
+        <w:t xml:space="preserve">Purger mapping sensible : </w:t>
+      </w:r>
+      <w:r>
+        <w:rPr>
+          <w:rFonts w:ascii="Calibri" w:hAnsi="Calibri"/>
+          <w:b w:val="0"/>
+          <w:sz w:val="22"/>
+        </w:rPr>
+        <w:t>point de convergence final : trace `nom_expert`, `decision_expert`, `envoye_par`, purge la table de correspondance PII de l’execution.</w:t>
+      </w:r>
+    </w:p>
+    <w:p>
+      <w:pPr>
+        <w:spacing w:before="200" w:after="120" w:line="300" w:lineRule="auto"/>
+      </w:pPr>
+      <w:r>
+        <w:rPr>
+          <w:rFonts w:ascii="Calibri" w:hAnsi="Calibri"/>
+          <w:b/>
+          <w:color w:val="10263F"/>
+          <w:sz w:val="24"/>
+        </w:rPr>
+        <w:t>H. Plan de test recommande</w:t>
+      </w:r>
+    </w:p>
+    <w:p>
+      <w:pPr>
+        <w:pStyle w:val="ListNumber"/>
+        <w:spacing w:before="0" w:after="80" w:line="300" w:lineRule="auto"/>
+      </w:pPr>
+      <w:r>
+        <w:rPr>
+          <w:rFonts w:ascii="Calibri" w:hAnsi="Calibri"/>
+          <w:b w:val="0"/>
+          <w:sz w:val="22"/>
+        </w:rPr>
+        <w:t>Importer le JSON, configurer les 2 credentials (IMAP, Google Drive) et toutes les variables d’environnement du prerequis 0.</w:t>
+      </w:r>
+    </w:p>
+    <w:p>
+      <w:pPr>
+        <w:pStyle w:val="ListNumber"/>
+        <w:spacing w:before="0" w:after="80" w:line="300" w:lineRule="auto"/>
+      </w:pPr>
+      <w:r>
+        <w:rPr>
+          <w:rFonts w:ascii="Calibri" w:hAnsi="Calibri"/>
+          <w:b w:val="0"/>
+          <w:sz w:val="22"/>
+        </w:rPr>
+        <w:t>Test webhook, cas standard : POST avec un `type_document` non sensible (ex. « compte rendu ») et verifier que `Envoyer au client` s’execute directement, sans passer par l’expert.</w:t>
+      </w:r>
+    </w:p>
+    <w:p>
+      <w:pPr>
+        <w:pStyle w:val="ListNumber"/>
+        <w:spacing w:before="0" w:after="80" w:line="300" w:lineRule="auto"/>
+      </w:pPr>
+      <w:r>
+        <w:rPr>
+          <w:rFonts w:ascii="Calibri" w:hAnsi="Calibri"/>
+          <w:b w:val="0"/>
+          <w:sz w:val="22"/>
+        </w:rPr>
+        <w:t>Test webhook, cas sensible : POST avec `type_document: "Demande de visa officiel"` et verifier l’e-mail recu par l’expert, que l’execution reste en statut « waiting », puis tester le clic sur Valider (envoi client via secretariat) et sur Rejeter (aucun envoi client, notification interne).</w:t>
+      </w:r>
+    </w:p>
+    <w:p>
+      <w:pPr>
+        <w:pStyle w:val="ListNumber"/>
+        <w:spacing w:before="0" w:after="80" w:line="300" w:lineRule="auto"/>
+      </w:pPr>
+      <w:r>
+        <w:rPr>
+          <w:rFonts w:ascii="Calibri" w:hAnsi="Calibri"/>
+          <w:b w:val="0"/>
+          <w:sz w:val="22"/>
+        </w:rPr>
+        <w:t>Test canal e-mail : envoyer un e-mail a la boite du cabinet avec un objet contenant « passeport » et une piece jointe scannee. Verifier que le fichier apparait dans le dossier Drive `Documents_Clients_Entrants_CONFIDENTIEL`, que le texte OCR extrait est coherent, et que le flux continue normalement dans le pipeline commun.</w:t>
+      </w:r>
+    </w:p>
+    <w:p>
+      <w:pPr>
+        <w:pStyle w:val="ListNumber"/>
+        <w:spacing w:before="0" w:after="80" w:line="300" w:lineRule="auto"/>
+      </w:pPr>
+      <w:r>
+        <w:rPr>
+          <w:rFonts w:ascii="Calibri" w:hAnsi="Calibri"/>
+          <w:b w:val="0"/>
+          <w:sz w:val="22"/>
+        </w:rPr>
+        <w:t>Verifier la purge : controler la sortie du nœud final `Purger mapping sensible`, le champ `envoye_par` doit refleter correctement le chemin emprunte.</w:t>
+      </w:r>
+    </w:p>
+    <w:p>
+      <w:pPr>
+        <w:pStyle w:val="ListNumber"/>
+        <w:spacing w:before="0" w:after="200" w:line="300" w:lineRule="auto"/>
+      </w:pPr>
+      <w:r>
+        <w:rPr>
+          <w:rFonts w:ascii="Calibri" w:hAnsi="Calibri"/>
+          <w:b w:val="0"/>
+          <w:sz w:val="22"/>
+        </w:rPr>
+        <w:t>Avant mise en production : repasser sur la checklist de la section 10 de ce guide (rotation des secrets, controle des logs d’execution, qui approuve/diffuse).</w:t>
+      </w:r>
+    </w:p>
+    <w:p>
+      <w:pPr>
         <w:spacing w:before="0" w:after="200" w:line="300" w:lineRule="auto"/>
       </w:pPr>
       <w:r>

</xml_diff>